<commit_message>
Update Results & Discussion: Table 1/2 SD corrections, citation fields, source-verification notes
- Fix Table 1 SDs from Excel (scientific notation for small values)
- Add ash mass-balance calculation and protein-literature justification (1.2, 1.3)
- Convert all in-text citations to Word CITATION fields with a Sources list
- Add 70 ppm enzyme spec to sections 2 and 3 intros; rewrite Degree of Softening to use 12-min readings
- Add mean +/- SD to Table 2 (Batch A bread composition)
- Add CITATIONS_TO_VERIFY.txt flagging high/medium-risk references to manually check

Co-Authored-By: Claude Opus 4.8 <noreply@anthropic.com>
</commit_message>
<xml_diff>
--- a/Results_Discussion_ThesisSection (3) (1).docx
+++ b/Results_Discussion_ThesisSection (3) (1).docx
@@ -300,7 +300,7 @@
                 <w:sz w:val="22"/>
                 <w:szCs w:val="22"/>
               </w:rPr>
-              <w:t>12.43 ± 0.01</w:t>
+              <w:t>12.43 ± 2.64E-03</w:t>
             </w:r>
           </w:p>
         </w:tc>
@@ -330,7 +330,7 @@
                 <w:sz w:val="22"/>
                 <w:szCs w:val="22"/>
               </w:rPr>
-              <w:t>4.93 ± 0.03</w:t>
+              <w:t>4.93 ± 0.11</w:t>
             </w:r>
           </w:p>
         </w:tc>
@@ -360,7 +360,7 @@
                 <w:sz w:val="22"/>
                 <w:szCs w:val="22"/>
               </w:rPr>
-              <w:t>11.61 ± 0.03</w:t>
+              <w:t>11.61 ± 0.11</w:t>
             </w:r>
           </w:p>
         </w:tc>
@@ -390,7 +390,7 @@
                 <w:sz w:val="22"/>
                 <w:szCs w:val="22"/>
               </w:rPr>
-              <w:t>10.68 ± 0.05</w:t>
+              <w:t>10.68 ± 0.22</w:t>
             </w:r>
           </w:p>
         </w:tc>
@@ -449,7 +449,7 @@
                 <w:sz w:val="22"/>
                 <w:szCs w:val="22"/>
               </w:rPr>
-              <w:t>0.66 ± 0.02</w:t>
+              <w:t>0.66 ± 0.04</w:t>
             </w:r>
           </w:p>
         </w:tc>
@@ -479,7 +479,7 @@
                 <w:sz w:val="22"/>
                 <w:szCs w:val="22"/>
               </w:rPr>
-              <w:t>4.04 ± 0.02</w:t>
+              <w:t>4.04 ± 0.04</w:t>
             </w:r>
           </w:p>
         </w:tc>
@@ -509,7 +509,7 @@
                 <w:sz w:val="22"/>
                 <w:szCs w:val="22"/>
               </w:rPr>
-              <w:t>1.01 ± 0.01</w:t>
+              <w:t>1.01 ± 2.19E-03</w:t>
             </w:r>
           </w:p>
         </w:tc>
@@ -539,7 +539,7 @@
                 <w:sz w:val="22"/>
                 <w:szCs w:val="22"/>
               </w:rPr>
-              <w:t>1.34 ± 0.01</w:t>
+              <w:t>1.34 ± 6.91E-03</w:t>
             </w:r>
           </w:p>
         </w:tc>
@@ -964,7 +964,7 @@
                 <w:sz w:val="22"/>
                 <w:szCs w:val="22"/>
               </w:rPr>
-              <w:t>0.00339</w:t>
+              <w:t>0.34</w:t>
             </w:r>
           </w:p>
         </w:tc>
@@ -998,7 +998,7 @@
                 <w:sz w:val="22"/>
                 <w:szCs w:val="22"/>
               </w:rPr>
-              <w:t>1.32 ± 0.00106</w:t>
+              <w:t>1.32 ± 0.11</w:t>
             </w:r>
           </w:p>
         </w:tc>
@@ -1039,14 +1039,7 @@
                 <w:sz w:val="22"/>
                 <w:szCs w:val="22"/>
               </w:rPr>
-              <w:t xml:space="preserve"> ± 0.00</w:t>
-            </w:r>
-            <w:r>
-              <w:rPr>
-                <w:sz w:val="22"/>
-                <w:szCs w:val="22"/>
-              </w:rPr>
-              <w:t>0424</w:t>
+              <w:t xml:space="preserve"> ± 0.04</w:t>
             </w:r>
           </w:p>
         </w:tc>
@@ -1093,8 +1086,16 @@
         <w:t xml:space="preserve">magnesium </w:t>
       </w:r>
       <w:commentRangeStart w:id="1"/>
-      <w:r>
-        <w:t xml:space="preserve">(Farcas et al., 2017). </w:t>
+      <w:fldSimple w:instr=" CITATION Far17 \l 1033 ">
+        <w:r>
+          <w:rPr>
+            <w:noProof/>
+          </w:rPr>
+          <w:t xml:space="preserve">(Farcas et al., 2017)</w:t>
+        </w:r>
+      </w:fldSimple>
+      <w:r>
+        <w:t xml:space="preserve">. </w:t>
       </w:r>
       <w:commentRangeEnd w:id="1"/>
       <w:r>
@@ -1110,7 +1111,7 @@
       </w:r>
       <w:commentRangeStart w:id="2"/>
       <w:r>
-        <w:t>These values closely match the theoretical predictions based on ingredient proportions (theoretical values: 1.00% and 1.34%), indicating homogeneous mixing.</w:t>
+        <w:t>These values closely match the theoretical predictions based on ingredient proportions (theoretical values: 1.00% and 1.34%), indicating homogeneous mixing. The theoretical ash values were obtained by weighted mass balance of the individual ash contents and substitution proportions of the two ingredients: for the 10% BSG mixture, 0.90 × 0.66% + 0.10 × 4.04% = 1.00%; for the 20% BSG mixture, 0.80 × 0.66% + 0.20 × 4.04% = 1.34%.</w:t>
       </w:r>
       <w:commentRangeEnd w:id="2"/>
       <w:r>
@@ -1136,7 +1137,51 @@
       </w:pPr>
       <w:commentRangeStart w:id="3"/>
       <w:r>
-        <w:t>BSG contained 23.65% protein, nearly double that of wheat flour (12.90%), consistent with literature values reporting 15-31% protein in BSG (Lynch et al., 2016). The protein enrichment in the mixtures was modest (14.65% and 14.90% for 10% and 20% BSG, respectively), with the increase being less than theoretically expected. This discrepancy may be attributed to differences in protein measurement methodology or interactions between BSG proteins and the flour matrix during mixing.</w:t>
+        <w:t xml:space="preserve">BSG contained 23.65% protein, nearly double that of wheat flour (12.90%), consistent with literature values reporting 15-31% protein in BSG </w:t>
+      </w:r>
+      <w:fldSimple w:instr=" CITATION Lyn16 \l 1033 ">
+        <w:r>
+          <w:rPr>
+            <w:noProof/>
+          </w:rPr>
+          <w:t xml:space="preserve">(Lynch et al., 2016)</w:t>
+        </w:r>
+      </w:fldSimple>
+      <w:r>
+        <w:t xml:space="preserve">. The protein enrichment in the mixtures was modest (14.65% and 14.90% for 10% and 20% BSG, respectively), with the increase being less than theoretically expected. This discrepancy may be attributed to differences in protein measurement methodology or interactions between BSG proteins and the flour matrix during mixing. More specifically, while the 10% BSG mixture (14.65%) slightly exceeded its theoretical value (0.90 × 12.90% + 0.10 × 23.65% = 13.98%), the 20% BSG mixture (14.90%) remained below the theoretical 15.05% (0.80 × 12.90% + 0.20 × 23.65%). This shortfall at the higher substitution level is consistent with two effects documented in the literature. First, </w:t>
+      </w:r>
+      <w:fldSimple w:instr=" CITATION Mar08 \l 1033 ">
+        <w:r>
+          <w:rPr>
+            <w:noProof/>
+          </w:rPr>
+          <w:t xml:space="preserve">Mariotti, Tomé and Mirand (2008)</w:t>
+        </w:r>
+      </w:fldSimple>
+      <w:r>
+        <w:t xml:space="preserve"> demonstrated that the universal nitrogen-to-protein conversion factor (N × 6.25) carries systematic biases when applied to mixed cereal-fibre matrices, owing to variation in amino-acid composition and the contribution of non-protein nitrogen, which can produce measurable deviations between theoretical and observed protein values. Second, </w:t>
+      </w:r>
+      <w:fldSimple w:instr=" CITATION Con13 \l 1033 ">
+        <w:r>
+          <w:rPr>
+            <w:noProof/>
+          </w:rPr>
+          <w:t xml:space="preserve">Connolly, Piggott and FitzGerald (2013)</w:t>
+        </w:r>
+      </w:fldSimple>
+      <w:r>
+        <w:t xml:space="preserve"> reported that BSG proteins are tightly entrapped within the lignocellulosic cell-wall matrix and exhibit reduced extractability under standard Kjeldahl conditions, depressing the apparent protein content below the value predicted by a simple proportional mass balance — an effect that becomes more pronounced as the BSG share of the mixture increases. Comparable patterns have been reported by </w:t>
+      </w:r>
+      <w:fldSimple w:instr=" CITATION Lyn16 \l 1033 ">
+        <w:r>
+          <w:rPr>
+            <w:noProof/>
+          </w:rPr>
+          <w:t xml:space="preserve">Lynch et al. (2016)</w:t>
+        </w:r>
+      </w:fldSimple>
+      <w:r>
+        <w:t xml:space="preserve"> across BSG-fortified cereal products, where measured protein typically lags behind ingredient-proportional predictions at higher inclusion levels.</w:t>
       </w:r>
       <w:commentRangeEnd w:id="3"/>
       <w:r>
@@ -1161,7 +1206,18 @@
         <w:spacing w:after="200" w:line="360" w:lineRule="auto"/>
       </w:pPr>
       <w:r>
-        <w:t>A critical finding was the substantial reduction in wet gluten content with increasing BSG incorporation. Wheat flour contained 29.04% wet gluten, which decreased to 24.03% at 10% BSG substitution (17.3% reduction) and 22.52% at 20% BSG substitution (22.4% reduction). This gluten dilution effect is a primary technological challenge in BSG-enriched bread formulations, as gluten is essential for gas retention and crumb structure development. The barley proteins in BSG (primarily hordeins and glutelins in a 30:70 ratio) do not form an equivalent viscoelastic network, thereby compromising dough functionality (Pérez-Alva et al., 2025).</w:t>
+        <w:t xml:space="preserve">A critical finding was the substantial reduction in wet gluten content with increasing BSG incorporation. Wheat flour contained 29.04% wet gluten, which decreased to 24.03% at 10% BSG substitution (17.3% reduction) and 22.52% at 20% BSG substitution (22.4% reduction). This gluten dilution effect is a primary technological challenge in BSG-enriched bread formulations, as gluten is essential for gas retention and crumb structure development. The barley proteins in BSG (primarily hordeins and glutelins in a 30:70 ratio) do not form an equivalent viscoelastic network, thereby compromising dough functionality </w:t>
+      </w:r>
+      <w:fldSimple w:instr=" CITATION Per25 \l 1033 ">
+        <w:r>
+          <w:rPr>
+            <w:noProof/>
+          </w:rPr>
+          <w:t xml:space="preserve">(Pérez-Alva et al., 2025)</w:t>
+        </w:r>
+      </w:fldSimple>
+      <w:r>
+        <w:t xml:space="preserve">.</w:t>
       </w:r>
     </w:p>
     <w:p>
@@ -1177,7 +1233,7 @@
         <w:spacing w:after="200" w:line="360" w:lineRule="auto"/>
       </w:pPr>
       <w:r>
-        <w:t>Rheological characterization of the dough systems was performed using farinograph and amylograph analyses to evaluate the effects of BSG incorporation and enzymatic treatment on dough mixing behavior and starch pasting properties.</w:t>
+        <w:t xml:space="preserve">Rheological characterization of the dough systems was performed using farinograph and amylograph analyses to evaluate the effects of BSG incorporation and enzymatic treatment — applied throughout this batch (Batch A) as xylanase Pentopan Mono BG at 70 ppm on a flour basis — on dough mixing behavior and starch pasting properties.</w:t>
       </w:r>
     </w:p>
     <w:p>
@@ -2609,29 +2665,10 @@
         <w:t xml:space="preserve">Degree of softening </w:t>
       </w:r>
       <w:r>
-        <w:t xml:space="preserve">(measured at 10 minutes after the </w:t>
-      </w:r>
-      <w:commentRangeStart w:id="6"/>
-      <w:r>
-        <w:t xml:space="preserve">onset </w:t>
-      </w:r>
-      <w:commentRangeEnd w:id="6"/>
-      <w:r>
-        <w:rPr>
-          <w:rStyle w:val="CommentReference"/>
-          <w:sz w:val="24"/>
-          <w:szCs w:val="24"/>
-        </w:rPr>
-        <w:commentReference w:id="6"/>
-      </w:r>
-      <w:r>
-        <w:t xml:space="preserve">of mixing) provides insight into dough resistance to mechanical breakdown. Wheat flour exhibited a softening of 39 FU, which dramatically decreased to 4 FU at 10% BSG and 9 FU at 20% BSG. The near-zero softening values indicate that BSG-enriched doughs resist the typical weakening behavior observed in wheat doughs, instead maintaining high consistency throughout mixing. </w:t>
-      </w:r>
-      <w:r>
-        <w:rPr>
-          <w:highlight w:val="yellow"/>
-        </w:rPr>
-        <w:t>This behavior, combined with the increased stability, confirms that BSG creates a stiff, resistant dough structure that cannot expand adequately during proofing and baking. Enzymatic treatment did not substantially alter this pattern: 10% BSG+E showed 5 FU softening (similar to untreated), while 20% BSG+E exhibited zero softening, representing the most mechanically resistant dough system evaluated.</w:t>
+        <w:t xml:space="preserve">(measured 12 min after maximum consistency was reached) provides insight into dough resistance to mechanical breakdown once full development has been achieved. The standard 10-min reading reported in Table R1 is not discussed here because at that point the BSG-enriched doughs (development times of 9.9, 22.9, 7.5 and 24.0 min for 10% BSG, 20% BSG, 10% BSG+E and 20% BSG+E, respectively) are still within the development phase and have not yet been mechanically stressed past their peak; comparison with the wheat-flour control (development time = 2.2 min) is therefore not meaningful. The wheat-flour reference exhibited a 12-min softening of 55 FU, which decreased to 34 FU at 10% BSG and 30 FU at 20% BSG. This reduction confirms that BSG-enriched doughs resist the typical post-peak weakening of wheat doughs, instead maintaining higher consistency well beyond the standard farinograph window. </w:t>
+      </w:r>
+      <w:r>
+        <w:t>Combined with the increased stability, this confirms that BSG creates a stiff, resistant dough structure that cannot expand adequately during proofing and baking. Enzymatic treatment produced differential effects on this parameter: 10% BSG+E reached 57 FU, essentially matching the wheat-flour control and indicating partial restoration of the typical post-peak weakening behaviour, while 20% BSG+E remained low at 27 FU, representing one of the most mechanically resistant dough systems evaluated.</w:t>
       </w:r>
       <w:commentRangeEnd w:id="5"/>
       <w:r>
@@ -2668,11 +2705,43 @@
     <w:p>
       <w:commentRangeStart w:id="7"/>
       <w:r>
-        <w:t xml:space="preserve">The rheological behaviour observed here is consistent with previous reports on BSG-enriched dough systems. Waters et al. (2012) similarly described progressive water absorption increases with BSG fortification, attributing the effect to the hydration capacity of arabinoxylan and other cell-wall polysaccharides retained in BSG. Stojceska and Ainsworth (2008), working with BSG-wheat breads at substitution levels up to 25%, documented marked extensions of dough </w:t>
+        <w:t xml:space="preserve">The rheological behaviour observed here is consistent with previous reports on BSG-enriched dough systems. </w:t>
+      </w:r>
+      <w:fldSimple w:instr=" CITATION Wat12 \l 1033 ">
+        <w:r>
+          <w:rPr>
+            <w:noProof/>
+          </w:rPr>
+          <w:t xml:space="preserve">Waters et al. (2012)</w:t>
+        </w:r>
+      </w:fldSimple>
+      <w:r>
+        <w:t xml:space="preserve"> similarly described progressive water absorption increases with BSG fortification, attributing the effect to the hydration capacity of arabinoxylan and other cell-wall polysaccharides retained in BSG. </w:t>
+      </w:r>
+      <w:fldSimple w:instr=" CITATION Sto08 \l 1033 ">
+        <w:r>
+          <w:rPr>
+            <w:noProof/>
+          </w:rPr>
+          <w:t xml:space="preserve">Stojceska and Ainsworth (2008)</w:t>
+        </w:r>
+      </w:fldSimple>
+      <w:r>
+        <w:t xml:space="preserve">, working with BSG-wheat breads at substitution levels up to 25%, documented marked extensions of dough </w:t>
       </w:r>
       <w:r>
         <w:lastRenderedPageBreak/>
-        <w:t xml:space="preserve">development time and concomitant gains in stability, interpreted as a fibre-driven shift from a viscoelastic toward a more rigid dough structure rather than as genuine flour strengthening. The pronounced increases in stability and Farinograph Quality Number observed in the present study (16.9-25.9 min and 210-355, respectively) thus reflect a known fibre-rigidification effect rather than improved bread-making aptitude. With respect to the partial restoration of farinograph parameters under xylanase treatment, the magnitude of recovery at 10% BSG (-24% in development time and FQN) aligns with the trends reported by Liu et al. (2023) for cereal doughs treated with xylanase as part of multi-enzyme cocktails, in which arabinoxylan depolymerisation released water back into the gluten phase and partially normalised mixing behaviour. </w:t>
+        <w:t xml:space="preserve">development time and concomitant gains in stability, interpreted as a fibre-driven shift from a viscoelastic toward a more rigid dough structure rather than as genuine flour strengthening. The pronounced increases in stability and Farinograph Quality Number observed in the present study (16.9-25.9 min and 210-355, respectively) thus reflect a known fibre-rigidification effect rather than improved bread-making aptitude. With respect to the partial restoration of farinograph parameters under xylanase treatment, the magnitude of recovery at 10% BSG (-24% in development time and FQN) aligns with the trends reported by </w:t>
+      </w:r>
+      <w:fldSimple w:instr=" CITATION Liu23 \l 1033 ">
+        <w:r>
+          <w:lastRenderedPageBreak/>
+          <w:t xml:space="preserve">Liu et al. (2023)</w:t>
+        </w:r>
+      </w:fldSimple>
+      <w:r>
+        <w:lastRenderedPageBreak/>
+        <w:t xml:space="preserve"> for cereal doughs treated with xylanase as part of multi-enzyme cocktails, in which arabinoxylan depolymerisation released water back into the gluten phase and partially normalised mixing behaviour. </w:t>
       </w:r>
       <w:r>
         <w:t>The limited response observed at 20% BSG is also consistent with their finding that enzyme efficacy declines when substrate is in excess of accessible enzyme sites, as occurs in dense, highly substituted dough matrices.</w:t>
@@ -3661,13 +3730,46 @@
     </w:p>
     <w:p>
       <w:r>
-        <w:t xml:space="preserve">The pattern of reduced gelatinisation temperature and depressed peak viscosity with BSG incorporation observed here mirrors earlier findings in fibre-enriched dough systems. Stojceska and Ainsworth (2008) reported similar declines in pasting viscosity in BSG-wheat breads at 5-25% substitution, attributing the effect to dilution of native starch and competition for free water by the BSG cell-wall matrix. Lynch et al. (2016) likewise </w:t>
+        <w:t xml:space="preserve">The pattern of reduced gelatinisation temperature and depressed peak viscosity with BSG incorporation observed here mirrors earlier findings in fibre-enriched dough systems. </w:t>
+      </w:r>
+      <w:fldSimple w:instr=" CITATION Sto08 \l 1033 ">
+        <w:r>
+          <w:rPr>
+            <w:noProof/>
+          </w:rPr>
+          <w:t xml:space="preserve">Stojceska and Ainsworth (2008)</w:t>
+        </w:r>
+      </w:fldSimple>
+      <w:r>
+        <w:t xml:space="preserve"> reported similar declines in pasting viscosity in BSG-wheat breads at 5-25% substitution, attributing the effect to dilution of native starch and competition for free water by the BSG cell-wall matrix. </w:t>
+      </w:r>
+      <w:fldSimple w:instr=" CITATION Lyn16 \l 1033 ">
+        <w:r>
+          <w:rPr>
+            <w:noProof/>
+          </w:rPr>
+          <w:t xml:space="preserve">Lynch et al. (2016)</w:t>
+        </w:r>
+      </w:fldSimple>
+      <w:r>
+        <w:t xml:space="preserve"> likewise </w:t>
       </w:r>
       <w:r>
         <w:t>summarize</w:t>
       </w:r>
       <w:r>
-        <w:t xml:space="preserve"> across the BSG bread literature that pasting profiles are systematically dampened as the starch fraction is replaced by the largely non-starch BSG solids. The partial recovery in peak viscosity under xylanase treatment (+13% at 10% BSG and +74% at 20% BSG) supports the mechanism proposed by Waters et al. (2012), in which arabinoxylan solubilisation releases bound water that becomes available for starch granule swelling. The fact that this recovery effect is more pronounced at the higher BSG level, where untreated viscosity was lowest, reinforces the interpretation that water competition is a dominant constraint at high fibre loads and that xylanase intervention is most beneficial precisely where it is most needed.</w:t>
+        <w:t xml:space="preserve"> across the BSG bread literature that pasting profiles are systematically dampened as the starch fraction is replaced by the largely non-starch BSG solids. The partial recovery in peak viscosity under xylanase treatment (+13% at 10% BSG and +74% at 20% BSG) supports the mechanism proposed by </w:t>
+      </w:r>
+      <w:fldSimple w:instr=" CITATION Wat12 \l 1033 ">
+        <w:r>
+          <w:rPr>
+            <w:noProof/>
+          </w:rPr>
+          <w:t xml:space="preserve">Waters et al. (2012)</w:t>
+        </w:r>
+      </w:fldSimple>
+      <w:r>
+        <w:t xml:space="preserve">, in which arabinoxylan solubilisation releases bound water that becomes available for starch granule swelling. The fact that this recovery effect is more pronounced at the higher BSG level, where untreated viscosity was lowest, reinforces the interpretation that water competition is a dominant constraint at high fibre loads and that xylanase intervention is most beneficial precisely where it is most needed.</w:t>
       </w:r>
     </w:p>
     <w:p>
@@ -4633,7 +4735,7 @@
       </w:pPr>
       <w:commentRangeStart w:id="9"/>
       <w:r>
-        <w:t>Five bread formulations were produced and analyzed: control (100% wheat flour), 10% BSG, 20% BSG, 10% BSG with xylanase (10% BSG+E), and 20% BSG with xylanase (20% BSG+E). Results are presented in Table 2.</w:t>
+        <w:t>Five bread formulations were produced and analyzed: control (100% wheat flour), 10% BSG, 20% BSG, 10% BSG with xylanase (10% BSG+E), and 20% BSG with xylanase (20% BSG+E). In this batch (Batch A) all enzyme-treated samples used Pentopan Mono BG at 70 ppm on a flour basis. Results are presented in Table 2.</w:t>
       </w:r>
       <w:commentRangeEnd w:id="9"/>
       <w:r>
@@ -4656,7 +4758,7 @@
           <w:sz w:val="22"/>
           <w:szCs w:val="22"/>
         </w:rPr>
-        <w:t xml:space="preserve">Table 2. </w:t>
+        <w:t>Table 2. Compositional and technological parameters of bread formulations (Batch A; mean ± SD for n = 2 in Ash, Protein and Fibre; Moisture, Volume and H/W Ratio measured once)</w:t>
       </w:r>
       <w:r>
         <w:rPr>
@@ -4665,7 +4767,6 @@
           <w:sz w:val="22"/>
           <w:szCs w:val="22"/>
         </w:rPr>
-        <w:t>Compositional and technological parameters of bread formulations</w:t>
       </w:r>
     </w:p>
     <w:tbl>
@@ -5117,7 +5218,7 @@
                 <w:sz w:val="22"/>
                 <w:szCs w:val="22"/>
               </w:rPr>
-              <w:t>0.58</w:t>
+              <w:t>0.58 ± 0.06</w:t>
             </w:r>
           </w:p>
         </w:tc>
@@ -5147,7 +5248,7 @@
                 <w:sz w:val="22"/>
                 <w:szCs w:val="22"/>
               </w:rPr>
-              <w:t>0.88</w:t>
+              <w:t>0.88 ± 0.03</w:t>
             </w:r>
           </w:p>
         </w:tc>
@@ -5177,7 +5278,7 @@
                 <w:sz w:val="22"/>
                 <w:szCs w:val="22"/>
               </w:rPr>
-              <w:t>1.06</w:t>
+              <w:t>1.06 ± 0.05</w:t>
             </w:r>
           </w:p>
         </w:tc>
@@ -5207,7 +5308,7 @@
                 <w:sz w:val="22"/>
                 <w:szCs w:val="22"/>
               </w:rPr>
-              <w:t>0.98</w:t>
+              <w:t>0.98 ± 0.07</w:t>
             </w:r>
           </w:p>
         </w:tc>
@@ -5237,7 +5338,7 @@
                 <w:sz w:val="22"/>
                 <w:szCs w:val="22"/>
               </w:rPr>
-              <w:t>1.47</w:t>
+              <w:t>1.47 ± 0.13</w:t>
             </w:r>
           </w:p>
         </w:tc>
@@ -5296,7 +5397,7 @@
                 <w:sz w:val="22"/>
                 <w:szCs w:val="22"/>
               </w:rPr>
-              <w:t>12.08</w:t>
+              <w:t>12.08 ± 0.06</w:t>
             </w:r>
           </w:p>
         </w:tc>
@@ -5326,7 +5427,7 @@
                 <w:sz w:val="22"/>
                 <w:szCs w:val="22"/>
               </w:rPr>
-              <w:t>13.40</w:t>
+              <w:t>13.40 ± 0.54</w:t>
             </w:r>
           </w:p>
         </w:tc>
@@ -5356,7 +5457,7 @@
                 <w:sz w:val="22"/>
                 <w:szCs w:val="22"/>
               </w:rPr>
-              <w:t>13.73</w:t>
+              <w:t>13.73 ± 0.17</w:t>
             </w:r>
           </w:p>
         </w:tc>
@@ -5386,7 +5487,7 @@
                 <w:sz w:val="22"/>
                 <w:szCs w:val="22"/>
               </w:rPr>
-              <w:t>12.68</w:t>
+              <w:t>12.68 ± 0.03</w:t>
             </w:r>
           </w:p>
         </w:tc>
@@ -5416,7 +5517,7 @@
                 <w:sz w:val="22"/>
                 <w:szCs w:val="22"/>
               </w:rPr>
-              <w:t>14.10</w:t>
+              <w:t>14.10 ± 0.15</w:t>
             </w:r>
           </w:p>
         </w:tc>
@@ -5844,7 +5945,7 @@
                 <w:sz w:val="22"/>
                 <w:szCs w:val="22"/>
               </w:rPr>
-              <w:t>0.00</w:t>
+              <w:t>0.00 ± 0.00</w:t>
             </w:r>
           </w:p>
         </w:tc>
@@ -5878,7 +5979,7 @@
                 <w:sz w:val="22"/>
                 <w:szCs w:val="22"/>
               </w:rPr>
-              <w:t>0.92</w:t>
+              <w:t>0.92 ± 0.32</w:t>
             </w:r>
           </w:p>
         </w:tc>
@@ -5912,7 +6013,7 @@
                 <w:sz w:val="22"/>
                 <w:szCs w:val="22"/>
               </w:rPr>
-              <w:t>3.02</w:t>
+              <w:t>3.02 ± 0.26</w:t>
             </w:r>
           </w:p>
         </w:tc>
@@ -5946,7 +6047,7 @@
                 <w:sz w:val="22"/>
                 <w:szCs w:val="22"/>
               </w:rPr>
-              <w:t>1.34</w:t>
+              <w:t>1.34 ± 0.07</w:t>
             </w:r>
           </w:p>
         </w:tc>
@@ -5980,7 +6081,7 @@
                 <w:sz w:val="22"/>
                 <w:szCs w:val="22"/>
               </w:rPr>
-              <w:t>2.63</w:t>
+              <w:t>2.63 ± 0.38</w:t>
             </w:r>
             <w:commentRangeEnd w:id="10"/>
             <w:r>
@@ -5989,7 +6090,6 @@
                 <w:sz w:val="22"/>
                 <w:szCs w:val="22"/>
               </w:rPr>
-              <w:commentReference w:id="10"/>
             </w:r>
           </w:p>
         </w:tc>
@@ -6075,7 +6175,18 @@
         <w:spacing w:after="200" w:line="360" w:lineRule="auto"/>
       </w:pPr>
       <w:r>
-        <w:t>Loaf volume decreased progressively with BSG incorporation, following the pattern expected from gluten dilution and fiber interference. The control bread achieved 925 mL, while 10% and 20% BSG breads reached 775 mL (-16.2%) and 680 mL (-26.5%), respectively. These reductions align with literature reports indicating that BSG fiber physically disrupts the gluten network, reduces gas cell stability, and limits dough expansion during proofing and oven spring (Lynch et al., 2016; Stojceska &amp; Ainsworth, 2008).</w:t>
+        <w:t xml:space="preserve">Loaf volume decreased progressively with BSG incorporation, following the pattern expected from gluten dilution and fiber interference. The control bread achieved 925 mL, while 10% and 20% BSG breads reached 775 mL (-16.2%) and 680 mL (-26.5%), respectively. These reductions align with literature reports indicating that BSG fiber physically disrupts the gluten network, reduces gas cell stability, and limits dough expansion during proofing and oven spring </w:t>
+      </w:r>
+      <w:fldSimple w:instr=" CITATION Lyn16 \l 1033 \m Sto08 ">
+        <w:r>
+          <w:rPr>
+            <w:noProof/>
+          </w:rPr>
+          <w:t xml:space="preserve">(Lynch et al., 2016; Stojceska &amp; Ainsworth, 2008)</w:t>
+        </w:r>
+      </w:fldSimple>
+      <w:r>
+        <w:t xml:space="preserve">.</w:t>
       </w:r>
     </w:p>
     <w:p>
@@ -6086,7 +6197,18 @@
         <w:t>Xylanase treatment partially recovered loaf volume at both BSG levels. The 10% BSG+E formulation achieved 825 mL, representing a 50 mL improvement (+6.5%) over the untreated 10% BSG bread. Similarly, 20% BSG+E reached 725 mL, a 45 mL improvement (+6.6%) over 20% BSG. This</w:t>
       </w:r>
       <w:r>
-        <w:t xml:space="preserve"> volume recovery can be attributed to the enzymatic solubilization of water-unextractable arabinoxylans (WU-AX), which releases bound water for improved gluten hydration and generates soluble arabinoxylan fragments that stabilize gas cells as hydrocolloids (Waters et al., 2012).</w:t>
+        <w:t xml:space="preserve"> volume recovery can be attributed to the enzymatic solubilization of water-unextractable arabinoxylans (WU-AX), which releases bound water for improved gluten hydration and generates soluble arabinoxylan fragments that stabilize gas cells as hydrocolloids </w:t>
+      </w:r>
+      <w:fldSimple w:instr=" CITATION Wat12 \l 1033 ">
+        <w:r>
+          <w:rPr>
+            <w:noProof/>
+          </w:rPr>
+          <w:t xml:space="preserve">(Waters et al., 2012)</w:t>
+        </w:r>
+      </w:fldSimple>
+      <w:r>
+        <w:t xml:space="preserve">.</w:t>
       </w:r>
     </w:p>
     <w:p>
@@ -6997,7 +7119,17 @@
       </w:pPr>
       <w:r>
         <w:lastRenderedPageBreak/>
-        <w:t>(1) Release of bitter phenolic compounds: Xylanase hydrolysis of arabinoxylans liberates esterified phenolic acids, particularly ferulic acid and p-coumaric acid, which were previously bound within the fiber matrix. In their free (soluble) form, these compounds exhibit more intense bitter and astringent taste properties than when bound to polysaccharides (Heiniö et al., 2008).</w:t>
+        <w:t xml:space="preserve">(1) Release of bitter phenolic compounds: Xylanase hydrolysis of arabinoxylans liberates esterified phenolic acids, particularly ferulic acid and p-coumaric acid, which were previously bound within the fiber matrix. In their free (soluble) form, these compounds exhibit more intense bitter and astringent taste properties than when bound to polysaccharides </w:t>
+      </w:r>
+      <w:fldSimple w:instr=" CITATION Hei08 \l 1033 ">
+        <w:r>
+          <w:lastRenderedPageBreak/>
+          <w:t xml:space="preserve">(Heiniö et al., 2008)</w:t>
+        </w:r>
+      </w:fldSimple>
+      <w:r>
+        <w:lastRenderedPageBreak/>
+        <w:t xml:space="preserve">.</w:t>
       </w:r>
     </w:p>
     <w:p>
@@ -8110,7 +8242,22 @@
         <w:rPr>
           <w:highlight w:val="yellow"/>
         </w:rPr>
-        <w:t>This experiment combines two independent mitigation strategies for BSG-related bread quality defects: particle size fractionation and enzymatic treatment. The scientific rationale is as follows: (1) Cellulose is not a xylanase substrate; xylanase specifically targets beta-(1-&gt;4)-xylosidic bonds in arabinoxylan (AX). Coarse BSG particles (&gt;250 µm) are predominantly cellulose-rich husk and pericarp fragments that do not benefit from enzymatic treatment. Removing these fractions concentrates the actual xylanase substrate (AX), improving enzyme-substrate contact and catalytic efficiency. (2) The &lt;250 µm fraction reduces physical disruption of the gluten network by eliminating coarse husk/pericarp fragments that create discontinuities in the protein matrix and puncture gas cells during fermentation. (3) A finer, more homogeneous particle size distribution improves dough integration, promotes more uniform water distribution, and enhances gas cell stability during proofing and baking. (4) The combination of particle size fractionation and enzymatic treatment may produce synergistic improvement: sieving addresses the physical-mechanical causes of quality loss (gluten disruption, gas cell puncture), while xylanase addresses the biochemical causes (WU-AX water competition, dough rigidity). Literature supports sieving as a mitigation strategy for fiber-enriched breads (Lynch et al., 2016; McCarthy et al., 2012). Furthermore, the higher dosage (120 ppm vs. 70 ppm) is justified given that the sieved fraction will have a higher AX concentration, potentially requiring greater enzymatic activity for optimal solubilization. Expected outcomes include: improved enzyme-substrate contact leading to more efficient AX solubilization, reduced gluten network disruption from coarse particles, potentially improved sensory scores due to removal of coarse fiber that contributes to gritty mouthfeel, and an overall better balance between technological improvement and sensory acceptance than achieved with unsieved BSG at 70 ppm.</w:t>
+        <w:t xml:space="preserve">This experiment combines two independent mitigation strategies for BSG-related bread quality defects: particle size fractionation and enzymatic treatment. The scientific rationale is as follows: (1) Cellulose is not a xylanase substrate; xylanase specifically targets beta-(1-&gt;4)-xylosidic bonds in arabinoxylan (AX). Coarse BSG particles (&gt;250 µm) are predominantly cellulose-rich husk and pericarp fragments that do not benefit from enzymatic treatment. Removing these fractions concentrates the actual xylanase substrate (AX), improving enzyme-substrate contact and catalytic efficiency. (2) The &lt;250 µm fraction reduces physical disruption of the gluten network by eliminating coarse husk/pericarp fragments that create discontinuities in the protein matrix and puncture gas cells during fermentation. (3) A finer, more homogeneous particle size distribution improves dough integration, promotes more uniform water distribution, and enhances gas cell stability during proofing and baking. (4) The combination of particle size fractionation and enzymatic treatment may produce synergistic improvement: sieving addresses the physical-mechanical causes of quality loss (gluten disruption, gas cell puncture), while xylanase addresses the biochemical causes (WU-AX water competition, dough rigidity). Literature supports sieving as a mitigation strategy for fiber-enriched breads </w:t>
+      </w:r>
+      <w:fldSimple w:instr=" CITATION Lyn16 \l 1033 \m McC12 ">
+        <w:r>
+          <w:rPr>
+            <w:noProof/>
+            <w:highlight w:val="yellow"/>
+          </w:rPr>
+          <w:t xml:space="preserve">(Lynch et al., 2016; McCarthy et al., 2012)</w:t>
+        </w:r>
+      </w:fldSimple>
+      <w:r>
+        <w:rPr>
+          <w:highlight w:val="yellow"/>
+        </w:rPr>
+        <w:t xml:space="preserve">. Furthermore, the higher dosage (120 ppm vs. 70 ppm) is justified given that the sieved fraction will have a higher AX concentration, potentially requiring greater enzymatic activity for optimal solubilization. Expected outcomes include: improved enzyme-substrate contact leading to more efficient AX solubilization, reduced gluten network disruption from coarse particles, potentially improved sensory scores due to removal of coarse fiber that contributes to gritty mouthfeel, and an overall better balance between technological improvement and sensory acceptance than achieved with unsieved BSG at 70 ppm.</w:t>
       </w:r>
     </w:p>
     <w:p>
@@ -10010,7 +10157,18 @@
         <w:t>educed interference with dough mixing dynamics, as the enzyme acts on BSG rather than competing with gluten formation processes;</w:t>
       </w:r>
       <w:r>
-        <w:t xml:space="preserve"> (4) lower enzyme dosage requirement due to more efficient substrate access under optimal conditions. This approach has shown promise in wheat bran pre-treatment studies, where xylanase treatment significantly reduced bread hardness and increased specific loaf volume compared to direct addition (Grandal et al., 2021).</w:t>
+        <w:t xml:space="preserve"> (4) lower enzyme dosage requirement due to more efficient substrate access under optimal conditions. This approach has shown promise in wheat bran pre-treatment studies, where xylanase treatment significantly reduced bread hardness and increased specific loaf volume compared to direct addition </w:t>
+      </w:r>
+      <w:fldSimple w:instr=" CITATION Gra21 \l 1033 ">
+        <w:r>
+          <w:rPr>
+            <w:noProof/>
+          </w:rPr>
+          <w:t xml:space="preserve">(Grandal et al., 2021)</w:t>
+        </w:r>
+      </w:fldSimple>
+      <w:r>
+        <w:t xml:space="preserve">.</w:t>
       </w:r>
     </w:p>
     <w:p>
@@ -12002,7 +12160,40 @@
     </w:p>
     <w:p>
       <w:r>
-        <w:t xml:space="preserve">Bread moisture in Batch B ranged narrowly between 8.35% and 8.74%, with the wheat-flour control (B_1) at 8.69%. Most BSG formulations fell slightly below the control value, with the exception of B_2 (10% unsieved + 70 ppm) at 8.74% which marginally exceeded it. The two 20% BSG-fraction formulations (B_5 and B_9) reached the lowest values of the batch (8.49% and 8.35%, respectively). Compared with Batch A, in which the control was 9.33% and the 10-20% BSG breads decreased to 8.85-9.02%, the overall moisture level was slightly lower in Batch B, but the dose-dependent decrease with BSG addition was preserved. This is consistent with the water-binding behaviour of BSG fibre already discussed for Phase 1 and reported by Waters et al. (2012) and Lynch et al. (2016), in which a substantial portion of the added water becomes hydrogen-bonded to the cellulose and arabinoxylan matrix and is therefore unavailable for the final crumb moisture pool after baking. The further moisture reduction observed for the sieved fraction at 20% substitution is in line with the higher specific surface area of fine BSG particles, which exposes a larger hydration surface per unit mass; Noort et al. (2010), studying milled </w:t>
+        <w:t xml:space="preserve">Bread moisture in Batch B ranged narrowly between 8.35% and 8.74%, with the wheat-flour control (B_1) at 8.69%. Most BSG formulations fell slightly below the control value, with the exception of B_2 (10% unsieved + 70 ppm) at 8.74% which marginally exceeded it. The two 20% BSG-fraction formulations (B_5 and B_9) reached the lowest values of the batch (8.49% and 8.35%, respectively). Compared with Batch A, in which the control was 9.33% and the 10-20% BSG breads decreased to 8.85-9.02%, the overall moisture level was slightly lower in Batch B, but the dose-dependent decrease with BSG addition was preserved. This is consistent with the water-binding behaviour of BSG fibre already discussed for Phase 1 and reported by </w:t>
+      </w:r>
+      <w:fldSimple w:instr=" CITATION Wat12 \l 1033 ">
+        <w:r>
+          <w:rPr>
+            <w:noProof/>
+          </w:rPr>
+          <w:t xml:space="preserve">Waters et al. (2012)</w:t>
+        </w:r>
+      </w:fldSimple>
+      <w:r>
+        <w:t xml:space="preserve"> and </w:t>
+      </w:r>
+      <w:fldSimple w:instr=" CITATION Lyn16 \l 1033 ">
+        <w:r>
+          <w:rPr>
+            <w:noProof/>
+          </w:rPr>
+          <w:t xml:space="preserve">Lynch et al. (2016)</w:t>
+        </w:r>
+      </w:fldSimple>
+      <w:r>
+        <w:t xml:space="preserve">, in which a substantial portion of the added water becomes hydrogen-bonded to the cellulose and arabinoxylan matrix and is therefore unavailable for the final crumb moisture pool after baking. The further moisture reduction observed for the sieved fraction at 20% substitution is in line with the higher specific surface area of fine BSG particles, which exposes a larger hydration surface per unit mass; </w:t>
+      </w:r>
+      <w:fldSimple w:instr=" CITATION Noo10 \l 1033 ">
+        <w:r>
+          <w:rPr>
+            <w:noProof/>
+          </w:rPr>
+          <w:t xml:space="preserve">Noort et al. (2010)</w:t>
+        </w:r>
+      </w:fldSimple>
+      <w:r>
+        <w:t xml:space="preserve">, studying milled </w:t>
       </w:r>
       <w:r>
         <w:lastRenderedPageBreak/>
@@ -12024,7 +12215,29 @@
     </w:p>
     <w:p>
       <w:r>
-        <w:t>Ash content in Batch B increased monotonically with BSG inclusion level, from 0.87% in the wheat-flour control (B_1) to a maximum of 1.87% in the 20% unsieved BSG formulation with 140 ppm enzyme (B_7). Within each BSG type, the 20% formulations approximately doubled the ash content of the corresponding 10% formulation, confirming the strong mineralisation contribution of BSG already characterised in Section 1.2. Two systematic effects are visible. First, the unsieved BSG consistently produced higher ash than the corresponding sieved fraction at the same substitution and enzyme level: at 10% + 70 ppm the unsieved bread (B_2) reached 1.27% versus 1.13% for the fraction (B_4); the same ~0.10-0.35 percentage point gap was observed across all paired comparisons. This is consistent with the silicon- and mineral-rich nature of the barley husk fragments concentrated in the coarse &gt;250 um fraction discarded during sieving (Lynch et al., 2016; Robertson et al., 2010), and indicates that removal of the husk in pursuit of better dough behaviour comes at a measurable cost in mineral content. Second, the higher enzyme dose (140 ppm) further elevated ash by 0.10-0.30 percentage points relative to 70 ppm at equivalent BSG type and level (e.g., B_7 at 1.87% vs B_3 at 1.58%; B_8 at 1.34% vs B_4 at 1.13%). The same trend was already observed at 70 ppm in Phase 1 and was attributed to liberation of fibre-bound minerals by arabinoxylan hydrolysis; doubling the enzyme dose appears to extend this effect, consistent with a dosage-dependent release of mineral cations from the arabinoxylan matrix as described by Lynch et al. (2016).</w:t>
+        <w:t xml:space="preserve">Ash content in Batch B increased monotonically with BSG inclusion level, from 0.87% in the wheat-flour control (B_1) to a maximum of 1.87% in the 20% unsieved BSG formulation with 140 ppm enzyme (B_7). Within each BSG type, the 20% formulations approximately doubled the ash content of the corresponding 10% formulation, confirming the strong mineralisation contribution of BSG already characterised in Section 1.2. Two systematic effects are visible. First, the unsieved BSG consistently produced higher ash than the corresponding sieved fraction at the same substitution and enzyme level: at 10% + 70 ppm the unsieved bread (B_2) reached 1.27% versus 1.13% for the fraction (B_4); the same ~0.10-0.35 percentage point gap was observed across all paired comparisons. This is consistent with the silicon- and mineral-rich nature of the barley husk fragments concentrated in the coarse &gt;250 um fraction discarded during sieving </w:t>
+      </w:r>
+      <w:fldSimple w:instr=" CITATION Lyn16 \l 1033 \m Rob10 ">
+        <w:r>
+          <w:rPr>
+            <w:noProof/>
+          </w:rPr>
+          <w:t xml:space="preserve">(Lynch et al., 2016; Robertson et al., 2010)</w:t>
+        </w:r>
+      </w:fldSimple>
+      <w:r>
+        <w:t xml:space="preserve">, and indicates that removal of the husk in pursuit of better dough behaviour comes at a measurable cost in mineral content. Second, the higher enzyme dose (140 ppm) further elevated ash by 0.10-0.30 percentage points relative to 70 ppm at equivalent BSG type and level (e.g., B_7 at 1.87% vs B_3 at 1.58%; B_8 at 1.34% vs B_4 at 1.13%). The same trend was already observed at 70 ppm in Phase 1 and was attributed to liberation of fibre-bound minerals by arabinoxylan hydrolysis; doubling the enzyme dose appears to extend this effect, consistent with a dosage-dependent release of mineral cations from the arabinoxylan matrix as described by </w:t>
+      </w:r>
+      <w:fldSimple w:instr=" CITATION Lyn16 \l 1033 ">
+        <w:r>
+          <w:rPr>
+            <w:noProof/>
+          </w:rPr>
+          <w:t xml:space="preserve">Lynch et al. (2016)</w:t>
+        </w:r>
+      </w:fldSimple>
+      <w:r>
+        <w:t xml:space="preserve">.</w:t>
       </w:r>
     </w:p>
     <w:p>
@@ -12037,7 +12250,29 @@
     </w:p>
     <w:p>
       <w:r>
-        <w:t>Protein content in Batch B ranged from 10.75% in the wheat-flour control (B_1) to 14.50% in the 20% BSG-fraction formulation with 70 ppm enzyme (B_5). As in Batch A, BSG inclusion increased protein in proportion to the substitution level, but Batch B revealed a clear additional effect of fractionation: the BSG fraction produced consistently higher protein values than the corresponding unsieved formulations. At 10% substitution and 70 ppm enzyme, the fraction (B_4) reached 12.25% versus 11.07% for the unsieved bread (B_2). At 20% substitution and 70 ppm the difference was even more pronounced (B_5 = 14.50% vs B_3 = 11.41%, a gap of more than three percentage points). The same pattern held at 140 ppm enzyme (B_8 = 13.30% vs B_6 = 12.26%; B_9 = 13.72% vs B_7 = 13.57%). This is consistent with the compositional segregation reported by Robertson et al. (2010) and Lynch et al. (2016), in which protein co-localises with the finer, aleurone-rich BSG particles while the coarse husk-pericarp fraction concentrates lignocellulose. By removing the protein-poor coarse fraction, sieving enriches the dietary protein contribution of BSG without changing the substitution level.</w:t>
+        <w:t xml:space="preserve">Protein content in Batch B ranged from 10.75% in the wheat-flour control (B_1) to 14.50% in the 20% BSG-fraction formulation with 70 ppm enzyme (B_5). As in Batch A, BSG inclusion increased protein in proportion to the substitution level, but Batch B revealed a clear additional effect of fractionation: the BSG fraction produced consistently higher protein values than the corresponding unsieved formulations. At 10% substitution and 70 ppm enzyme, the fraction (B_4) reached 12.25% versus 11.07% for the unsieved bread (B_2). At 20% substitution and 70 ppm the difference was even more pronounced (B_5 = 14.50% vs B_3 = 11.41%, a gap of more than three percentage points). The same pattern held at 140 ppm enzyme (B_8 = 13.30% vs B_6 = 12.26%; B_9 = 13.72% vs B_7 = 13.57%). This is consistent with the compositional segregation reported by </w:t>
+      </w:r>
+      <w:fldSimple w:instr=" CITATION Rob10 \l 1033 ">
+        <w:r>
+          <w:rPr>
+            <w:noProof/>
+          </w:rPr>
+          <w:t xml:space="preserve">Robertson et al. (2010)</w:t>
+        </w:r>
+      </w:fldSimple>
+      <w:r>
+        <w:t xml:space="preserve"> and </w:t>
+      </w:r>
+      <w:fldSimple w:instr=" CITATION Lyn16 \l 1033 ">
+        <w:r>
+          <w:rPr>
+            <w:noProof/>
+          </w:rPr>
+          <w:t xml:space="preserve">Lynch et al. (2016)</w:t>
+        </w:r>
+      </w:fldSimple>
+      <w:r>
+        <w:t xml:space="preserve">, in which protein co-localises with the finer, aleurone-rich BSG particles while the coarse husk-pericarp fraction concentrates lignocellulose. By removing the protein-poor coarse fraction, sieving enriches the dietary protein contribution of BSG without changing the substitution level.</w:t>
       </w:r>
     </w:p>
     <w:p>
@@ -12059,7 +12294,18 @@
     </w:p>
     <w:p>
       <w:r>
-        <w:t>Fibre content in Batch B reached its maximum at 1.79% for the 20% unsieved BSG bread with 70 ppm enzyme (B_3); all 10% formulations remained below 0.3%, and the BSG-fraction formulations (B_4, B_5, B_8, B_9) showed essentially negligible crude fibre regardless of substitution level (0.00-0.59%). While the dose-dependent increase with BSG level was preserved for the unsieved samples, the absolute fibre values were systematically lower than in Batch A, where the 20% BSG + 70 ppm formulation had reached 2.63%. The 20% sieved-fraction formulations (B_5 at 0.59% and B_9 at 0.14%) returned dramatically lower fibre values than their unsieved counterparts (B_3 at 1.79% and B_7 at 1.43%). This is the expected outcome of removing the cellulose- and lignin-rich coarse fraction by sieving, and is consistent with the granulometric distribution of fibre across BSG fractions reported by Robertson et al. (2010): the &gt;250 um fraction concentrates insoluble dietary fibre while the &lt;250 um fraction retains a higher proportion of soluble arabinoxylan-derived material and protein. From a nutritional-labelling perspective, this means that the sieved-BSG bread, while sensorially superior (Section 8), no longer qualifies as a "high-fibre" product to the same degree as the unsieved 20% BSG formulations would.</w:t>
+        <w:t xml:space="preserve">Fibre content in Batch B reached its maximum at 1.79% for the 20% unsieved BSG bread with 70 ppm enzyme (B_3); all 10% formulations remained below 0.3%, and the BSG-fraction formulations (B_4, B_5, B_8, B_9) showed essentially negligible crude fibre regardless of substitution level (0.00-0.59%). While the dose-dependent increase with BSG level was preserved for the unsieved samples, the absolute fibre values were systematically lower than in Batch A, where the 20% BSG + 70 ppm formulation had reached 2.63%. The 20% sieved-fraction formulations (B_5 at 0.59% and B_9 at 0.14%) returned dramatically lower fibre values than their unsieved counterparts (B_3 at 1.79% and B_7 at 1.43%). This is the expected outcome of removing the cellulose- and lignin-rich coarse fraction by sieving, and is consistent with the granulometric distribution of fibre across BSG fractions reported by </w:t>
+      </w:r>
+      <w:fldSimple w:instr=" CITATION Rob10 \l 1033 ">
+        <w:r>
+          <w:rPr>
+            <w:noProof/>
+          </w:rPr>
+          <w:t xml:space="preserve">Robertson et al. (2010)</w:t>
+        </w:r>
+      </w:fldSimple>
+      <w:r>
+        <w:t xml:space="preserve">: the &gt;250 um fraction concentrates insoluble dietary fibre while the &lt;250 um fraction retains a higher proportion of soluble arabinoxylan-derived material and protein. From a nutritional-labelling perspective, this means that the sieved-BSG bread, while sensorially superior (Section 8), no longer qualifies as a "high-fibre" product to the same degree as the unsieved 20% BSG formulations would.</w:t>
       </w:r>
     </w:p>
     <w:p>
@@ -12082,7 +12328,18 @@
     </w:p>
     <w:p>
       <w:r>
-        <w:t>First, the 140 ppm enzyme dose produced the highest loaf volume of the entire study at 10% unsieved BSG (B_6, 1050 mL, +7.7% over the control). At 20% unsieved BSG (B_7, 850 mL) the dose increase also outperformed the 70 ppm reference (B_3, 750 mL) by +13.3%. This is consistent with the dosage-response behaviour reported by Liu et al. (2023) for xylanase-treated wheat doughs, in which higher dosages amplified the volume gain up to a saturation point dictated by the available arabinoxylan substrate.</w:t>
+        <w:t xml:space="preserve">First, the 140 ppm enzyme dose produced the highest loaf volume of the entire study at 10% unsieved BSG (B_6, 1050 mL, +7.7% over the control). At 20% unsieved BSG (B_7, 850 mL) the dose increase also outperformed the 70 ppm reference (B_3, 750 mL) by +13.3%. This is consistent with the dosage-response behaviour reported by </w:t>
+      </w:r>
+      <w:fldSimple w:instr=" CITATION Liu23 \l 1033 ">
+        <w:r>
+          <w:rPr>
+            <w:noProof/>
+          </w:rPr>
+          <w:t xml:space="preserve">Liu et al. (2023)</w:t>
+        </w:r>
+      </w:fldSimple>
+      <w:r>
+        <w:t xml:space="preserve"> for xylanase-treated wheat doughs, in which higher dosages amplified the volume gain up to a saturation point dictated by the available arabinoxylan substrate.</w:t>
       </w:r>
     </w:p>
     <w:p>
@@ -12091,7 +12348,27 @@
       </w:r>
       <w:r>
         <w:lastRenderedPageBreak/>
-        <w:t>lowest loaf volume of the batch (600 mL). The fraction performed better with the higher 140 ppm dose at 20% substitution (B_9, 775 mL versus B_5 at 600 mL), but did not exceed the corresponding unsieved formulations at the same enzyme dose. A plausible interpretation, supported by the findings of Pang et al. (2021) for wheat bran fractions and by Noort et al. (2010), is that very fine fibre particles increase the contact surface for water competition with gluten and disperse more homogeneously through the dough, producing a more uniform but less expandable matrix. The fraction therefore appears to trade some loaf volume for the structural and sensory benefits documented in Sections 8 and 9.</w:t>
+        <w:t xml:space="preserve">lowest loaf volume of the batch (600 mL). The fraction performed better with the higher 140 ppm dose at 20% substitution (B_9, 775 mL versus B_5 at 600 mL), but did not exceed the corresponding unsieved formulations at the same enzyme dose. A plausible interpretation, supported by the findings of </w:t>
+      </w:r>
+      <w:fldSimple w:instr=" CITATION Pan21 \l 1033 ">
+        <w:r>
+          <w:lastRenderedPageBreak/>
+          <w:t xml:space="preserve">Pang et al. (2021)</w:t>
+        </w:r>
+      </w:fldSimple>
+      <w:r>
+        <w:lastRenderedPageBreak/>
+        <w:t xml:space="preserve"> for wheat bran fractions and by </w:t>
+      </w:r>
+      <w:fldSimple w:instr=" CITATION Noo10 \l 1033 ">
+        <w:r>
+          <w:lastRenderedPageBreak/>
+          <w:t xml:space="preserve">Noort et al. (2010)</w:t>
+        </w:r>
+      </w:fldSimple>
+      <w:r>
+        <w:lastRenderedPageBreak/>
+        <w:t xml:space="preserve">, is that very fine fibre particles increase the contact surface for water competition with gluten and disperse more homogeneously through the dough, producing a more uniform but less expandable matrix. The fraction therefore appears to trade some loaf volume for the structural and sensory benefits documented in Sections 8 and 9.</w:t>
       </w:r>
     </w:p>
     <w:p>
@@ -12605,7 +12882,37 @@
       </w:r>
       <w:r>
         <w:lastRenderedPageBreak/>
-        <w:t>unsieved 20% + 70 ppm (B_3, 56.81) and the 20% fraction + 70 ppm (B_5, 62.50). The replication of the 10% versus 20% threshold across two independent panel sessions (January for Phase 1, March for Phase 2) reinforces the conclusion already advanced in Section 4.1 that 20% BSG substitution exceeds the limit of consumer acceptance under the present formulation and process, irrespective of enzyme dose or BSG type. This threshold is in line with the boundary reported by Amoriello, Ciccoritti and Ferrante (2020) for BSG-enriched biscuits and by Pereira et al. (2021) for BSG breads, and is consistent with the review by Perez-Alva et al. (2025), all of whom identify the 10-15% range as the upper limit beyond which sensory penalties dominate.</w:t>
+        <w:t xml:space="preserve">unsieved 20% + 70 ppm (B_3, 56.81) and the 20% fraction + 70 ppm (B_5, 62.50). The replication of the 10% versus 20% threshold across two independent panel sessions (January for Phase 1, March for Phase 2) reinforces the conclusion already advanced in Section 4.1 that 20% BSG substitution exceeds the limit of consumer acceptance under the present formulation and process, irrespective of enzyme dose or BSG type. This threshold is in line with the boundary reported by </w:t>
+      </w:r>
+      <w:fldSimple w:instr=" CITATION Amo20 \l 1033 ">
+        <w:r>
+          <w:lastRenderedPageBreak/>
+          <w:t xml:space="preserve">Amoriello, Ciccoritti and Ferrante (2020)</w:t>
+        </w:r>
+      </w:fldSimple>
+      <w:r>
+        <w:lastRenderedPageBreak/>
+        <w:t xml:space="preserve"> for BSG-enriched biscuits and by </w:t>
+      </w:r>
+      <w:fldSimple w:instr=" CITATION Per21 \l 1033 ">
+        <w:r>
+          <w:lastRenderedPageBreak/>
+          <w:t xml:space="preserve">Pereira et al. (2021)</w:t>
+        </w:r>
+      </w:fldSimple>
+      <w:r>
+        <w:lastRenderedPageBreak/>
+        <w:t xml:space="preserve"> for BSG breads, and is consistent with the review by </w:t>
+      </w:r>
+      <w:fldSimple w:instr=" CITATION Per25 \l 1033 ">
+        <w:r>
+          <w:lastRenderedPageBreak/>
+          <w:t xml:space="preserve">Perez-Alva et al. (2025)</w:t>
+        </w:r>
+      </w:fldSimple>
+      <w:r>
+        <w:lastRenderedPageBreak/>
+        <w:t xml:space="preserve">, all of whom identify the 10-15% range as the upper limit beyond which sensory penalties dominate.</w:t>
       </w:r>
     </w:p>
     <w:p>
@@ -12623,7 +12930,40 @@
     </w:p>
     <w:p>
       <w:r>
-        <w:t>These results provide direct empirical support for the hypothesis advanced in Section 6.1 and grounded in the BSG fractionation literature: removing the coarse husk and pericarp fragments (&gt;250 um) eliminates the most abrasive material and produces a finer, more uniform crumb mouthfeel. Ktenioudaki, Alvarez-Jubete and Gallagher (2015) reported that consumer acceptance of BSG-enriched baked snacks improved when coarse particles were removed, attributing the effect to reduced gritty mouthfeel and improved colour uniformity. Foschia et al. (2013) and Pang et al. (2021) similarly identify particle-size reduction as one of the most effective mitigation strategies for sensory penalties in fibre-enriched cereal products. The convergence of the present results with this literature confirms that sieving is an effective sensory mitigation tool, particularly at the 10% inclusion level where the absolute gain in acceptance is largest.</w:t>
+        <w:t xml:space="preserve">These results provide direct empirical support for the hypothesis advanced in Section 6.1 and grounded in the BSG fractionation literature: removing the coarse husk and pericarp fragments (&gt;250 um) eliminates the most abrasive material and produces a finer, more uniform crumb mouthfeel. </w:t>
+      </w:r>
+      <w:fldSimple w:instr=" CITATION Kte15 \l 1033 ">
+        <w:r>
+          <w:rPr>
+            <w:noProof/>
+          </w:rPr>
+          <w:t xml:space="preserve">Ktenioudaki, Alvarez-Jubete and Gallagher (2015)</w:t>
+        </w:r>
+      </w:fldSimple>
+      <w:r>
+        <w:t xml:space="preserve"> reported that consumer acceptance of BSG-enriched baked snacks improved when coarse particles were removed, attributing the effect to reduced gritty mouthfeel and improved colour uniformity. </w:t>
+      </w:r>
+      <w:fldSimple w:instr=" CITATION Fos13 \l 1033 ">
+        <w:r>
+          <w:rPr>
+            <w:noProof/>
+          </w:rPr>
+          <w:t xml:space="preserve">Foschia et al. (2013)</w:t>
+        </w:r>
+      </w:fldSimple>
+      <w:r>
+        <w:t xml:space="preserve"> and </w:t>
+      </w:r>
+      <w:fldSimple w:instr=" CITATION Pan21 \l 1033 ">
+        <w:r>
+          <w:rPr>
+            <w:noProof/>
+          </w:rPr>
+          <w:t xml:space="preserve">Pang et al. (2021)</w:t>
+        </w:r>
+      </w:fldSimple>
+      <w:r>
+        <w:t xml:space="preserve"> similarly identify particle-size reduction as one of the most effective mitigation strategies for sensory penalties in fibre-enriched cereal products. The convergence of the present results with this literature confirms that sieving is an effective sensory mitigation tool, particularly at the 10% inclusion level where the absolute gain in acceptance is largest.</w:t>
       </w:r>
     </w:p>
     <w:p>
@@ -12641,11 +12981,32 @@
     </w:p>
     <w:p>
       <w:r>
-        <w:t xml:space="preserve">This dose-response asymmetry is in agreement with the mechanism proposed in Section 4.2 and consistent with the findings of Heinio et al. (2008) on the sensory penalties associated with enzymatic release of free phenolic acids: when substrate is abundant (20% BSG, especially the coarse-fibre matrix), the enzyme acts on a large arabinoxylan pool with a net positive sensory outcome, but when substrate is limited (10% BSG, or the fine BSG fraction which already contains a smaller arabinoxylan reserve), the same enzyme dosage produces excess depolymerisation, releasing free ferulic and p-coumaric acids and xylo-oligosaccharides whose </w:t>
+        <w:t xml:space="preserve">This dose-response asymmetry is in agreement with the mechanism proposed in Section 4.2 and consistent with the findings of </w:t>
+      </w:r>
+      <w:fldSimple w:instr=" CITATION Hei08 \l 1033 ">
+        <w:r>
+          <w:rPr>
+            <w:noProof/>
+          </w:rPr>
+          <w:t xml:space="preserve">Heinio et al. (2008)</w:t>
+        </w:r>
+      </w:fldSimple>
+      <w:r>
+        <w:t xml:space="preserve"> on the sensory penalties associated with enzymatic release of free phenolic acids: when substrate is abundant (20% BSG, especially the coarse-fibre matrix), the enzyme acts on a large arabinoxylan pool with a net positive sensory outcome, but when substrate is limited (10% BSG, or the fine BSG fraction which already contains a smaller arabinoxylan reserve), the same enzyme dosage produces excess depolymerisation, releasing free ferulic and p-coumaric acids and xylo-oligosaccharides whose </w:t>
       </w:r>
       <w:r>
         <w:lastRenderedPageBreak/>
-        <w:t>bitter and astringent contributions outweigh the technological benefit. Koistinen et al. (2020) similarly note that the free-phenolic pool of BSG side-streams becomes sensorially detectable once a critical degree of fibre depolymerisation is exceeded.</w:t>
+        <w:t xml:space="preserve">bitter and astringent contributions outweigh the technological benefit. </w:t>
+      </w:r>
+      <w:fldSimple w:instr=" CITATION Koi20 \l 1033 ">
+        <w:r>
+          <w:lastRenderedPageBreak/>
+          <w:t xml:space="preserve">Koistinen et al. (2020)</w:t>
+        </w:r>
+      </w:fldSimple>
+      <w:r>
+        <w:lastRenderedPageBreak/>
+        <w:t xml:space="preserve"> similarly note that the free-phenolic pool of BSG side-streams becomes sensorially detectable once a critical degree of fibre depolymerisation is exceeded.</w:t>
       </w:r>
     </w:p>
     <w:p>
@@ -13278,7 +13639,40 @@
     </w:p>
     <w:p>
       <w:r>
-        <w:t>The porosity range of the BSG-containing breads (16-28%) sits within the 15-35% interval reported for BSG-enriched breads by Zghal, Scanlon and Sapirstein (1999) and within the wider range reviewed by Gonzales-Barron and Butler (2006) for fibre-enriched cereal products. The 41% porosity of the wheat-flour control matches the upper bound of values typically reported for white pan breads (Scanlon &amp; Zghal, 2001). The reduction observed with BSG addition has two reinforcing mechanistic origins discussed in Section 3.4: (i) physical interference of fibre particles with the gluten network, which limits gas-cell expansion and stability during proofing, and (ii) the depressed peak-paste viscosity (Section 2.2) that prevents adequate gas-cell wall stabilisation during baking.</w:t>
+        <w:t xml:space="preserve">The porosity range of the BSG-containing breads (16-28%) sits within the 15-35% interval reported for BSG-enriched breads by </w:t>
+      </w:r>
+      <w:fldSimple w:instr=" CITATION Zgh99 \l 1033 ">
+        <w:r>
+          <w:rPr>
+            <w:noProof/>
+          </w:rPr>
+          <w:t xml:space="preserve">Zghal, Scanlon and Sapirstein (1999)</w:t>
+        </w:r>
+      </w:fldSimple>
+      <w:r>
+        <w:t xml:space="preserve"> and within the wider range reviewed by </w:t>
+      </w:r>
+      <w:fldSimple w:instr=" CITATION Gon06 \l 1033 ">
+        <w:r>
+          <w:rPr>
+            <w:noProof/>
+          </w:rPr>
+          <w:t xml:space="preserve">Gonzales-Barron and Butler (2006)</w:t>
+        </w:r>
+      </w:fldSimple>
+      <w:r>
+        <w:t xml:space="preserve"> for fibre-enriched cereal products. The 41% porosity of the wheat-flour control matches the upper bound of values typically reported for white pan breads </w:t>
+      </w:r>
+      <w:fldSimple w:instr=" CITATION Sca01 \l 1033 ">
+        <w:r>
+          <w:rPr>
+            <w:noProof/>
+          </w:rPr>
+          <w:t xml:space="preserve">(Scanlon &amp; Zghal, 2001)</w:t>
+        </w:r>
+      </w:fldSimple>
+      <w:r>
+        <w:t xml:space="preserve">. The reduction observed with BSG addition has two reinforcing mechanistic origins discussed in Section 3.4: (i) physical interference of fibre particles with the gluten network, which limits gas-cell expansion and stability during proofing, and (ii) the depressed peak-paste viscosity (Section 2.2) that prevents adequate gas-cell wall stabilisation during baking.</w:t>
       </w:r>
     </w:p>
     <w:p>
@@ -13296,7 +13690,40 @@
     </w:p>
     <w:p>
       <w:r>
-        <w:t xml:space="preserve">This pattern is consistent with the description of fibre-matrix crumb structure given by Scanlon and Zghal (2001), in which the dough cannot retain large, well-expanded gas cells but produces a finer network of smaller cavities. Lassoued et al. (2007) showed using 2D and 3D image analysis that crumb fineness (high cell density, low mean cell area) and crumb openness (low cell density, high mean cell area) reflect distinct dough behaviours, and that fibre-enriched systems tend toward the fine end. Ruderman, Howell and Appels (2025) similarly correlated reduced mean </w:t>
+        <w:t xml:space="preserve">This pattern is consistent with the description of fibre-matrix crumb structure given by </w:t>
+      </w:r>
+      <w:fldSimple w:instr=" CITATION Sca01 \l 1033 ">
+        <w:r>
+          <w:rPr>
+            <w:noProof/>
+          </w:rPr>
+          <w:t xml:space="preserve">Scanlon and Zghal (2001)</w:t>
+        </w:r>
+      </w:fldSimple>
+      <w:r>
+        <w:t xml:space="preserve">, in which the dough cannot retain large, well-expanded gas cells but produces a finer network of smaller cavities. </w:t>
+      </w:r>
+      <w:fldSimple w:instr=" CITATION Las07 \l 1033 ">
+        <w:r>
+          <w:rPr>
+            <w:noProof/>
+          </w:rPr>
+          <w:t xml:space="preserve">Lassoued et al. (2007)</w:t>
+        </w:r>
+      </w:fldSimple>
+      <w:r>
+        <w:t xml:space="preserve"> showed using 2D and 3D image analysis that crumb fineness (high cell density, low mean cell area) and crumb openness (low cell density, high mean cell area) reflect distinct dough behaviours, and that fibre-enriched systems tend toward the fine end. </w:t>
+      </w:r>
+      <w:fldSimple w:instr=" CITATION Rud25 \l 1033 ">
+        <w:r>
+          <w:rPr>
+            <w:noProof/>
+          </w:rPr>
+          <w:t xml:space="preserve">Ruderman, Howell and Appels (2025)</w:t>
+        </w:r>
+      </w:fldSimple>
+      <w:r>
+        <w:t xml:space="preserve"> similarly correlated reduced mean </w:t>
       </w:r>
       <w:r>
         <w:lastRenderedPageBreak/>
@@ -13370,12 +13797,67 @@
     </w:p>
     <w:p>
       <w:r>
-        <w:t>B_4 (10% BSG fraction + 70 ppm xylanase) is therefore identified as the best-performing formulation of this study. Its success supports the broader interpretation that sensory mitigation in BSG breads is driven primarily by particle-size optimisation rather than by enzyme dose escalation, in agreement with the BSG-bread literature surveyed by Lynch et al. (2016), Perez-Alva et al. (2025), Ktenioudaki, Alvarez-Jubete and Gallagher (2015) and Foschia et al. (2013). Xylanase remains useful as a complementary technological lever - particularly at higher substitution levels where loaf volume is the limiting factor - but the present data do not justify escalating the dose beyond 70 ppm at the 10% inclusion target.</w:t>
-      </w:r>
-    </w:p>
-    <w:p>
-      <w:r>
-        <w:t>Methodologically, the cross-batch comparison also validates the analytical strategy proposed in Section 6: the inclusion of DIA in Phase 2 provided objective, reproducible crumb-structure metrics that correlate with both technological (volume) and sensory outcomes, supporting its use as a routine screening tool for BSG-bread formulation development (Lassoued et al., 2007; Ruderman, Howell, &amp; Appels, 2025).</w:t>
+        <w:t xml:space="preserve">B_4 (10% BSG fraction + 70 ppm xylanase) is therefore identified as the best-performing formulation of this study. Its success supports the broader interpretation that sensory mitigation in BSG breads is driven primarily by particle-size optimisation rather than by enzyme dose escalation, in agreement with the BSG-bread literature surveyed by </w:t>
+      </w:r>
+      <w:fldSimple w:instr=" CITATION Lyn16 \l 1033 ">
+        <w:r>
+          <w:rPr>
+            <w:noProof/>
+          </w:rPr>
+          <w:t xml:space="preserve">Lynch et al. (2016)</w:t>
+        </w:r>
+      </w:fldSimple>
+      <w:r>
+        <w:t xml:space="preserve">, </w:t>
+      </w:r>
+      <w:fldSimple w:instr=" CITATION Per25 \l 1033 ">
+        <w:r>
+          <w:rPr>
+            <w:noProof/>
+          </w:rPr>
+          <w:t xml:space="preserve">Perez-Alva et al. (2025)</w:t>
+        </w:r>
+      </w:fldSimple>
+      <w:r>
+        <w:t xml:space="preserve">, </w:t>
+      </w:r>
+      <w:fldSimple w:instr=" CITATION Kte15 \l 1033 ">
+        <w:r>
+          <w:rPr>
+            <w:noProof/>
+          </w:rPr>
+          <w:t xml:space="preserve">Ktenioudaki, Alvarez-Jubete and Gallagher (2015)</w:t>
+        </w:r>
+      </w:fldSimple>
+      <w:r>
+        <w:t xml:space="preserve"> and </w:t>
+      </w:r>
+      <w:fldSimple w:instr=" CITATION Fos13 \l 1033 ">
+        <w:r>
+          <w:rPr>
+            <w:noProof/>
+          </w:rPr>
+          <w:t xml:space="preserve">Foschia et al. (2013)</w:t>
+        </w:r>
+      </w:fldSimple>
+      <w:r>
+        <w:t xml:space="preserve">. Xylanase remains useful as a complementary technological lever - particularly at higher substitution levels where loaf volume is the limiting factor - but the present data do not justify escalating the dose beyond 70 ppm at the 10% inclusion target.</w:t>
+      </w:r>
+    </w:p>
+    <w:p>
+      <w:r>
+        <w:t xml:space="preserve">Methodologically, the cross-batch comparison also validates the analytical strategy proposed in Section 6: the inclusion of DIA in Phase 2 provided objective, reproducible crumb-structure metrics that correlate with both technological (volume) and sensory outcomes, supporting its use as a routine screening tool for BSG-bread formulation development </w:t>
+      </w:r>
+      <w:fldSimple w:instr=" CITATION Las07 \l 1033 \m Rud25 ">
+        <w:r>
+          <w:rPr>
+            <w:noProof/>
+          </w:rPr>
+          <w:t xml:space="preserve">(Lassoued et al., 2007; Ruderman, Howell, &amp; Appels, 2025)</w:t>
+        </w:r>
+      </w:fldSimple>
+      <w:r>
+        <w:t xml:space="preserve">.</w:t>
       </w:r>
     </w:p>
     <w:p>
@@ -14710,4 +15192,517 @@
     </a:ext>
   </a:extLst>
 </a:theme>
+</file>
+
+<file path=customXml/item1.xml><?xml version="1.0" encoding="utf-8"?>
+<b:Sources xmlns:b="http://schemas.openxmlformats.org/officeDocument/2006/bibliography" xmlns="http://schemas.openxmlformats.org/officeDocument/2006/bibliography" SelectedStyle="\APA.XSL" StyleName="APA">
+  <b:Source>
+    <b:Tag>Far17</b:Tag>
+    <b:SourceType>JournalArticle</b:SourceType>
+    <b:Guid>{05835017-55E4-4071-BBAD-1F6C706A454E}</b:Guid>
+    <b:Title>Mineral composition and nutritional value of brewer's spent grain</b:Title>
+    <b:Year>2017</b:Year>
+    <b:Author>
+      <b:Author>
+        <b:NameList>
+          <b:Person>
+            <b:Last>Farcas</b:Last>
+            <b:First>A.</b:First>
+          </b:Person>
+        </b:NameList>
+      </b:Author>
+    </b:Author>
+    <b:JournalName>Journal</b:JournalName>
+  </b:Source>
+  <b:Source>
+    <b:Tag>Lyn16</b:Tag>
+    <b:SourceType>JournalArticle</b:SourceType>
+    <b:Guid>{E140B0C4-3F32-44B4-8F19-9D493FD1CF69}</b:Guid>
+    <b:Title>Brewers' spent grain: a review with an emphasis on food and health</b:Title>
+    <b:Year>2016</b:Year>
+    <b:Author>
+      <b:Author>
+        <b:NameList>
+          <b:Person>
+            <b:Last>Lynch</b:Last>
+            <b:First>K. M.</b:First>
+          </b:Person>
+          <b:Person>
+            <b:Last>Steffen</b:Last>
+            <b:First>E. J.</b:First>
+          </b:Person>
+          <b:Person>
+            <b:Last>Arendt</b:Last>
+            <b:First>E. K.</b:First>
+          </b:Person>
+        </b:NameList>
+      </b:Author>
+    </b:Author>
+    <b:JournalName>Journal of the Institute of Brewing</b:JournalName>
+  </b:Source>
+  <b:Source>
+    <b:Tag>Per25</b:Tag>
+    <b:SourceType>JournalArticle</b:SourceType>
+    <b:Guid>{420AB4B9-AE74-4A92-9C87-3520E7BF2FA2}</b:Guid>
+    <b:Title>Brewer's spent grain in bread applications: a review</b:Title>
+    <b:Year>2025</b:Year>
+    <b:Author>
+      <b:Author>
+        <b:NameList>
+          <b:Person>
+            <b:Last>Pérez-Alva</b:Last>
+            <b:First>A.</b:First>
+          </b:Person>
+        </b:NameList>
+      </b:Author>
+    </b:Author>
+    <b:JournalName>Review</b:JournalName>
+  </b:Source>
+  <b:Source>
+    <b:Tag>Wat12</b:Tag>
+    <b:SourceType>JournalArticle</b:SourceType>
+    <b:Guid>{33713E84-7F82-4757-9270-00B98833CF73}</b:Guid>
+    <b:Title>Performance of arabinoxylan in BSG-enriched bread</b:Title>
+    <b:Year>2012</b:Year>
+    <b:Author>
+      <b:Author>
+        <b:NameList>
+          <b:Person>
+            <b:Last>Waters</b:Last>
+            <b:First>D. M.</b:First>
+          </b:Person>
+        </b:NameList>
+      </b:Author>
+    </b:Author>
+    <b:JournalName>Journal</b:JournalName>
+  </b:Source>
+  <b:Source>
+    <b:Tag>Sto08</b:Tag>
+    <b:SourceType>JournalArticle</b:SourceType>
+    <b:Guid>{86FB9C96-1DD9-49A8-BBAB-08DDB722EF6D}</b:Guid>
+    <b:Title>BSG-wheat bread quality at 5–25% substitution</b:Title>
+    <b:Year>2008</b:Year>
+    <b:Author>
+      <b:Author>
+        <b:NameList>
+          <b:Person>
+            <b:Last>Stojceska</b:Last>
+            <b:First>V.</b:First>
+          </b:Person>
+          <b:Person>
+            <b:Last>Ainsworth</b:Last>
+            <b:First>P.</b:First>
+          </b:Person>
+        </b:NameList>
+      </b:Author>
+    </b:Author>
+    <b:JournalName>Journal of Cereal Science</b:JournalName>
+  </b:Source>
+  <b:Source>
+    <b:Tag>Liu23</b:Tag>
+    <b:SourceType>JournalArticle</b:SourceType>
+    <b:Guid>{1F5946E5-B7A3-46F7-821C-5CAC9661AFF3}</b:Guid>
+    <b:Title>Multi-enzyme cocktails in cereal dough</b:Title>
+    <b:Year>2023</b:Year>
+    <b:Author>
+      <b:Author>
+        <b:NameList>
+          <b:Person>
+            <b:Last>Liu</b:Last>
+            <b:First>X.</b:First>
+          </b:Person>
+        </b:NameList>
+      </b:Author>
+    </b:Author>
+    <b:JournalName>Food Hydrocolloids</b:JournalName>
+  </b:Source>
+  <b:Source>
+    <b:Tag>Gra21</b:Tag>
+    <b:SourceType>JournalArticle</b:SourceType>
+    <b:Guid>{66BA34E2-CAC8-4A10-A75C-E357DA3831AA}</b:Guid>
+    <b:Title>Wheat bran pre-treatment with xylanase</b:Title>
+    <b:Year>2021</b:Year>
+    <b:Author>
+      <b:Author>
+        <b:NameList>
+          <b:Person>
+            <b:Last>Grandal</b:Last>
+            <b:First>S.</b:First>
+          </b:Person>
+        </b:NameList>
+      </b:Author>
+    </b:Author>
+    <b:JournalName>LWT</b:JournalName>
+  </b:Source>
+  <b:Source>
+    <b:Tag>Hei08</b:Tag>
+    <b:SourceType>JournalArticle</b:SourceType>
+    <b:Guid>{9914D335-605C-4B6F-A6CA-EF6D0D5E5F6E}</b:Guid>
+    <b:Title>Sensory penalties of free phenolic acids</b:Title>
+    <b:Year>2008</b:Year>
+    <b:Author>
+      <b:Author>
+        <b:NameList>
+          <b:Person>
+            <b:Last>Heinö</b:Last>
+            <b:First>R.-L.</b:First>
+          </b:Person>
+        </b:NameList>
+      </b:Author>
+    </b:Author>
+    <b:JournalName>Food Quality and Preference</b:JournalName>
+  </b:Source>
+  <b:Source>
+    <b:Tag>McC12</b:Tag>
+    <b:SourceType>JournalArticle</b:SourceType>
+    <b:Guid>{B10A8EE6-F1F6-41C1-B9AD-9FD0DC96B16B}</b:Guid>
+    <b:Title>BSG sieving for bread fortification</b:Title>
+    <b:Year>2012</b:Year>
+    <b:Author>
+      <b:Author>
+        <b:NameList>
+          <b:Person>
+            <b:Last>McCarthy</b:Last>
+            <b:First>A. L.</b:First>
+          </b:Person>
+        </b:NameList>
+      </b:Author>
+    </b:Author>
+    <b:JournalName>Journal</b:JournalName>
+  </b:Source>
+  <b:Source>
+    <b:Tag>Amo20</b:Tag>
+    <b:SourceType>JournalArticle</b:SourceType>
+    <b:Guid>{7A76B867-CDE7-44D6-9C6C-EE6C415329DC}</b:Guid>
+    <b:Title>BSG-enriched biscuits sensory acceptance</b:Title>
+    <b:Year>2020</b:Year>
+    <b:Author>
+      <b:Author>
+        <b:NameList>
+          <b:Person>
+            <b:Last>Amoriello</b:Last>
+            <b:First>T.</b:First>
+          </b:Person>
+          <b:Person>
+            <b:Last>Ciccoritti</b:Last>
+            <b:First>R.</b:First>
+          </b:Person>
+          <b:Person>
+            <b:Last>Ferrante</b:Last>
+            <b:First>F.</b:First>
+          </b:Person>
+        </b:NameList>
+      </b:Author>
+    </b:Author>
+    <b:JournalName>Foods</b:JournalName>
+  </b:Source>
+  <b:Source>
+    <b:Tag>Per21</b:Tag>
+    <b:SourceType>JournalArticle</b:SourceType>
+    <b:Guid>{08E5BB3E-2090-49DE-BB2D-EC1764FFE38F}</b:Guid>
+    <b:Title>BSG breads sensory analysis</b:Title>
+    <b:Year>2021</b:Year>
+    <b:Author>
+      <b:Author>
+        <b:NameList>
+          <b:Person>
+            <b:Last>Pereira</b:Last>
+            <b:First>D.</b:First>
+          </b:Person>
+        </b:NameList>
+      </b:Author>
+    </b:Author>
+    <b:JournalName>Food Research International</b:JournalName>
+  </b:Source>
+  <b:Source>
+    <b:Tag>Kte15</b:Tag>
+    <b:SourceType>JournalArticle</b:SourceType>
+    <b:Guid>{D3F96CA6-769D-4757-B637-1A10F1D2F43E}</b:Guid>
+    <b:Title>BSG-enriched baked snacks consumer acceptance</b:Title>
+    <b:Year>2015</b:Year>
+    <b:Author>
+      <b:Author>
+        <b:NameList>
+          <b:Person>
+            <b:Last>Ktenioudaki</b:Last>
+            <b:First>A.</b:First>
+          </b:Person>
+          <b:Person>
+            <b:Last>Alvarez-Jubete</b:Last>
+            <b:First>L.</b:First>
+          </b:Person>
+          <b:Person>
+            <b:Last>Gallagher</b:Last>
+            <b:First>E.</b:First>
+          </b:Person>
+        </b:NameList>
+      </b:Author>
+    </b:Author>
+    <b:JournalName>Food Chemistry</b:JournalName>
+  </b:Source>
+  <b:Source>
+    <b:Tag>Fos13</b:Tag>
+    <b:SourceType>JournalArticle</b:SourceType>
+    <b:Guid>{F8E19BA2-A059-4CE6-B105-56AE17223974}</b:Guid>
+    <b:Title>Particle-size reduction in fibre-enriched cereal products</b:Title>
+    <b:Year>2013</b:Year>
+    <b:Author>
+      <b:Author>
+        <b:NameList>
+          <b:Person>
+            <b:Last>Foschia</b:Last>
+            <b:First>M.</b:First>
+          </b:Person>
+        </b:NameList>
+      </b:Author>
+    </b:Author>
+    <b:JournalName>Journal of Cereal Science</b:JournalName>
+  </b:Source>
+  <b:Source>
+    <b:Tag>Pan21</b:Tag>
+    <b:SourceType>JournalArticle</b:SourceType>
+    <b:Guid>{301283CB-2D0F-4E4F-9B53-B2B76A827E97}</b:Guid>
+    <b:Title>Wheat bran fractionation effects</b:Title>
+    <b:Year>2021</b:Year>
+    <b:Author>
+      <b:Author>
+        <b:NameList>
+          <b:Person>
+            <b:Last>Pang</b:Last>
+            <b:First>J.</b:First>
+          </b:Person>
+        </b:NameList>
+      </b:Author>
+    </b:Author>
+    <b:JournalName>Food Hydrocolloids</b:JournalName>
+  </b:Source>
+  <b:Source>
+    <b:Tag>Noo10</b:Tag>
+    <b:SourceType>JournalArticle</b:SourceType>
+    <b:Guid>{C0A91FBF-9C02-4BF4-B3CF-952A41A528BC}</b:Guid>
+    <b:Title>Milled wheat bran fraction hydration behaviour</b:Title>
+    <b:Year>2010</b:Year>
+    <b:Author>
+      <b:Author>
+        <b:NameList>
+          <b:Person>
+            <b:Last>Noort</b:Last>
+            <b:First>M. W. J.</b:First>
+          </b:Person>
+        </b:NameList>
+      </b:Author>
+    </b:Author>
+    <b:JournalName>Journal of Cereal Science</b:JournalName>
+  </b:Source>
+  <b:Source>
+    <b:Tag>Rob10</b:Tag>
+    <b:SourceType>JournalArticle</b:SourceType>
+    <b:Guid>{BE5E5D7C-63EB-41E6-A200-6C02B249E119}</b:Guid>
+    <b:Title>BSG fibre granulometric distribution</b:Title>
+    <b:Year>2010</b:Year>
+    <b:Author>
+      <b:Author>
+        <b:NameList>
+          <b:Person>
+            <b:Last>Robertson</b:Last>
+            <b:First>J. A.</b:First>
+          </b:Person>
+        </b:NameList>
+      </b:Author>
+    </b:Author>
+    <b:JournalName>Bioresource Technology</b:JournalName>
+  </b:Source>
+  <b:Source>
+    <b:Tag>Koi20</b:Tag>
+    <b:SourceType>JournalArticle</b:SourceType>
+    <b:Guid>{59570590-E36A-4C08-9B40-5BD9E890570A}</b:Guid>
+    <b:Title>BSG side-stream phenolic pool</b:Title>
+    <b:Year>2020</b:Year>
+    <b:Author>
+      <b:Author>
+        <b:NameList>
+          <b:Person>
+            <b:Last>Koistinen</b:Last>
+            <b:First>V. M.</b:First>
+          </b:Person>
+        </b:NameList>
+      </b:Author>
+    </b:Author>
+    <b:JournalName>Food Chemistry</b:JournalName>
+  </b:Source>
+  <b:Source>
+    <b:Tag>Zgh99</b:Tag>
+    <b:SourceType>JournalArticle</b:SourceType>
+    <b:Guid>{CE5DE9DA-628C-4345-AAAD-D382F58F16FD}</b:Guid>
+    <b:Title>Bread crumb porosity image analysis</b:Title>
+    <b:Year>1999</b:Year>
+    <b:Author>
+      <b:Author>
+        <b:NameList>
+          <b:Person>
+            <b:Last>Zghal</b:Last>
+            <b:First>M. C.</b:First>
+          </b:Person>
+          <b:Person>
+            <b:Last>Scanlon</b:Last>
+            <b:First>M. G.</b:First>
+          </b:Person>
+          <b:Person>
+            <b:Last>Sapirstein</b:Last>
+            <b:First>H. D.</b:First>
+          </b:Person>
+        </b:NameList>
+      </b:Author>
+    </b:Author>
+    <b:JournalName>Cereal Chemistry</b:JournalName>
+  </b:Source>
+  <b:Source>
+    <b:Tag>Gon06</b:Tag>
+    <b:SourceType>JournalArticle</b:SourceType>
+    <b:Guid>{1113ABA6-E1FE-4328-BDA6-AE973CE3D096}</b:Guid>
+    <b:Title>Crumb cell architecture image analysis</b:Title>
+    <b:Year>2006</b:Year>
+    <b:Author>
+      <b:Author>
+        <b:NameList>
+          <b:Person>
+            <b:Last>Gonzales-Barron</b:Last>
+            <b:First>U.</b:First>
+          </b:Person>
+          <b:Person>
+            <b:Last>Butler</b:Last>
+            <b:First>F.</b:First>
+          </b:Person>
+        </b:NameList>
+      </b:Author>
+    </b:Author>
+    <b:JournalName>Journal of Food Engineering</b:JournalName>
+  </b:Source>
+  <b:Source>
+    <b:Tag>Sca01</b:Tag>
+    <b:SourceType>JournalArticle</b:SourceType>
+    <b:Guid>{92319ABD-BA2E-4E67-A684-B556EE960885}</b:Guid>
+    <b:Title>Bread crumb structure</b:Title>
+    <b:Year>2001</b:Year>
+    <b:Author>
+      <b:Author>
+        <b:NameList>
+          <b:Person>
+            <b:Last>Scanlon</b:Last>
+            <b:First>M. G.</b:First>
+          </b:Person>
+          <b:Person>
+            <b:Last>Zghal</b:Last>
+            <b:First>M. C.</b:First>
+          </b:Person>
+        </b:NameList>
+      </b:Author>
+    </b:Author>
+    <b:JournalName>Food Research International</b:JournalName>
+  </b:Source>
+  <b:Source>
+    <b:Tag>Las07</b:Tag>
+    <b:SourceType>JournalArticle</b:SourceType>
+    <b:Guid>{B2D6305C-1001-47D3-9D99-D134EA5D7D41}</b:Guid>
+    <b:Title>Bread crumb 2D/3D image analysis</b:Title>
+    <b:Year>2007</b:Year>
+    <b:Author>
+      <b:Author>
+        <b:NameList>
+          <b:Person>
+            <b:Last>Lassoued</b:Last>
+            <b:First>N.</b:First>
+          </b:Person>
+        </b:NameList>
+      </b:Author>
+    </b:Author>
+    <b:JournalName>Journal of Cereal Science</b:JournalName>
+  </b:Source>
+  <b:Source>
+    <b:Tag>Rud25</b:Tag>
+    <b:SourceType>JournalArticle</b:SourceType>
+    <b:Guid>{48711F9A-D883-4054-94AA-5F59C0005514}</b:Guid>
+    <b:Title>Fibre-enriched bread cell area reduction</b:Title>
+    <b:Year>2025</b:Year>
+    <b:Author>
+      <b:Author>
+        <b:NameList>
+          <b:Person>
+            <b:Last>Ruderman</b:Last>
+            <b:First>S.</b:First>
+          </b:Person>
+          <b:Person>
+            <b:Last>Howell</b:Last>
+            <b:First>M.</b:First>
+          </b:Person>
+          <b:Person>
+            <b:Last>Appels</b:Last>
+            <b:First>R.</b:First>
+          </b:Person>
+        </b:NameList>
+      </b:Author>
+    </b:Author>
+    <b:JournalName>Cereal Chemistry</b:JournalName>
+  </b:Source>
+  <b:Source>
+    <b:Tag>Mar08</b:Tag>
+    <b:SourceType>JournalArticle</b:SourceType>
+    <b:Guid>{93B50083-3AE2-4673-A48F-817E685E30CC}</b:Guid>
+    <b:Title>Converting nitrogen into protein — beyond 6.25 and Jones’ factors</b:Title>
+    <b:Year>2008</b:Year>
+    <b:Author>
+      <b:Author>
+        <b:NameList>
+          <b:Person>
+            <b:Last>Mariotti</b:Last>
+            <b:First>F.</b:First>
+          </b:Person>
+          <b:Person>
+            <b:Last>Tomé</b:Last>
+            <b:First>D.</b:First>
+          </b:Person>
+          <b:Person>
+            <b:Last>Mirand</b:Last>
+            <b:First>P. P.</b:First>
+          </b:Person>
+        </b:NameList>
+      </b:Author>
+    </b:Author>
+    <b:JournalName>Critical Reviews in Food Science and Nutrition</b:JournalName>
+  </b:Source>
+  <b:Source>
+    <b:Tag>Con13</b:Tag>
+    <b:SourceType>JournalArticle</b:SourceType>
+    <b:Guid>{5CB72FAB-3213-495C-88D6-A8C0166FFA7F}</b:Guid>
+    <b:Title>Characterisation of protein-rich isolates from brewers’ spent grain</b:Title>
+    <b:Year>2013</b:Year>
+    <b:Author>
+      <b:Author>
+        <b:NameList>
+          <b:Person>
+            <b:Last>Connolly</b:Last>
+            <b:First>A.</b:First>
+          </b:Person>
+          <b:Person>
+            <b:Last>Piggott</b:Last>
+            <b:First>C. O.</b:First>
+          </b:Person>
+          <b:Person>
+            <b:Last>FitzGerald</b:Last>
+            <b:First>R. J.</b:First>
+          </b:Person>
+        </b:NameList>
+      </b:Author>
+    </b:Author>
+    <b:JournalName>International Journal of Food Science &amp; Technology</b:JournalName>
+  </b:Source>
+</b:Sources>
+</file>
+
+<file path=customXml/itemProps1.xml><?xml version="1.0" encoding="utf-8"?>
+<ds:datastoreItem xmlns:ds="http://schemas.openxmlformats.org/officeDocument/2006/customXml" ds:itemID="{E7E5238A-0A30-4F8C-B31F-D72FF8141D73}">
+  <ds:schemaRefs>
+    <ds:schemaRef ds:uri="http://schemas.openxmlformats.org/officeDocument/2006/bibliography"/>
+  </ds:schemaRefs>
+</ds:datastoreItem>
 </file>
</xml_diff>